<commit_message>
Complète le rapport final : sections 6 et 7, burndown J4 et J5
Section 7 : retire les deux passages signalés en relecture et reprend
la fiche de rétrospective (docs/07).
Section 6 : décisions du Product Owner sur les huit stories.
Section 4 : burndown à 0 au J4 et au J5, obstacle résolu au J4.
Annexe B : daily du J5. Le PDF est régénéré.

Refs #56

Co-Authored-By: Claude Opus 5.5 <noreply@anthropic.com>
</commit_message>
<xml_diff>
--- a/docs/08-rapport-final/rapport-final.docx
+++ b/docs/08-rapport-final/rapport-final.docx
@@ -1720,7 +1720,7 @@
           <w:b w:val="0"/>
           <w:i w:val="0"/>
         </w:rPr>
-        <w:t>Les points restants sont mis à jour chaque soir. Une story ne baisse le compteur qu'une fois terminée au sens de la Definition of Done, c'est pourquoi la courbe reste à 24 au jour 2. Au jour 3, US01 et US02 (5 points) sont terminées.</w:t>
+        <w:t>Les points restants sont mis à jour chaque soir. Une story ne baisse le compteur qu'une fois terminée au sens de la Definition of Done, c'est pourquoi la courbe reste à 24 au jour 2. Au jour 3, US01 et US02 (5 points) sont terminées. Au jour 4, les cinq autres stories engagées (19 points) sont terminées et acceptées par le Product Owner : le compteur tombe à 0, un jour avant la fin du sprint.</w:t>
       </w:r>
     </w:p>
     <w:tbl>
@@ -2024,11 +2024,9 @@
             <w:r>
               <w:rPr>
                 <w:b w:val="0"/>
-                <w:i/>
-                <w:color w:val="5B5D7E"/>
                 <w:sz w:val="20"/>
               </w:rPr>
-              <w:t>À compléter</w:t>
+              <w:t>0</w:t>
             </w:r>
           </w:p>
         </w:tc>
@@ -2086,11 +2084,9 @@
             <w:r>
               <w:rPr>
                 <w:b w:val="0"/>
-                <w:i/>
-                <w:color w:val="5B5D7E"/>
                 <w:sz w:val="20"/>
               </w:rPr>
-              <w:t>À compléter</w:t>
+              <w:t>0</w:t>
             </w:r>
           </w:p>
         </w:tc>
@@ -2136,7 +2132,7 @@
         <w:rPr>
           <w:b w:val="0"/>
         </w:rPr>
-        <w:t>Le Product Owner n'avait pas encore accepté l'invitation au dépôt GitHub (signalé au jour 2, toujours en cours au jour 4). Un guide pas à pas lui a été écrit pour valider les stories depuis le board.</w:t>
+        <w:t>Le Product Owner n'avait pas encore accepté l'invitation au dépôt GitHub (signalé au jour 2, résolu au jour 4 : il a accès au dépôt et au board). Un guide pas à pas lui a été écrit pour valider les stories depuis le board.</w:t>
       </w:r>
     </w:p>
     <w:p>
@@ -2323,6 +2319,7 @@
           </w:tcPr>
           <w:p>
             <w:pPr>
+              <w:keepNext/>
               <w:spacing w:after="0"/>
             </w:pPr>
             <w:r>
@@ -2342,6 +2339,7 @@
           </w:tcPr>
           <w:p>
             <w:pPr>
+              <w:keepNext/>
               <w:spacing w:after="0"/>
               <w:jc w:val="center"/>
             </w:pPr>
@@ -2362,6 +2360,7 @@
           </w:tcPr>
           <w:p>
             <w:pPr>
+              <w:keepNext/>
               <w:spacing w:after="0"/>
               <w:jc w:val="center"/>
             </w:pPr>
@@ -2382,6 +2381,7 @@
           </w:tcPr>
           <w:p>
             <w:pPr>
+              <w:keepNext/>
               <w:spacing w:after="0"/>
               <w:jc w:val="center"/>
             </w:pPr>
@@ -2406,6 +2406,7 @@
           </w:tcPr>
           <w:p>
             <w:pPr>
+              <w:keepNext/>
               <w:spacing w:after="0"/>
             </w:pPr>
             <w:r>
@@ -2423,6 +2424,7 @@
           </w:tcPr>
           <w:p>
             <w:pPr>
+              <w:keepNext/>
               <w:spacing w:after="0"/>
               <w:jc w:val="center"/>
             </w:pPr>
@@ -2441,6 +2443,7 @@
           </w:tcPr>
           <w:p>
             <w:pPr>
+              <w:keepNext/>
               <w:spacing w:after="0"/>
               <w:jc w:val="center"/>
             </w:pPr>
@@ -2459,6 +2462,7 @@
           </w:tcPr>
           <w:p>
             <w:pPr>
+              <w:keepNext/>
               <w:spacing w:after="0"/>
               <w:jc w:val="center"/>
             </w:pPr>
@@ -2483,6 +2487,7 @@
           </w:tcPr>
           <w:p>
             <w:pPr>
+              <w:keepNext/>
               <w:spacing w:after="0"/>
             </w:pPr>
             <w:r>
@@ -2501,6 +2506,7 @@
           </w:tcPr>
           <w:p>
             <w:pPr>
+              <w:keepNext/>
               <w:spacing w:after="0"/>
               <w:jc w:val="center"/>
             </w:pPr>
@@ -2520,6 +2526,7 @@
           </w:tcPr>
           <w:p>
             <w:pPr>
+              <w:keepNext/>
               <w:spacing w:after="0"/>
               <w:jc w:val="center"/>
             </w:pPr>
@@ -2539,6 +2546,7 @@
           </w:tcPr>
           <w:p>
             <w:pPr>
+              <w:keepNext/>
               <w:spacing w:after="0"/>
               <w:jc w:val="center"/>
             </w:pPr>
@@ -2562,6 +2570,7 @@
           </w:tcPr>
           <w:p>
             <w:pPr>
+              <w:keepNext/>
               <w:spacing w:after="0"/>
             </w:pPr>
             <w:r>
@@ -2579,6 +2588,7 @@
           </w:tcPr>
           <w:p>
             <w:pPr>
+              <w:keepNext/>
               <w:spacing w:after="0"/>
               <w:jc w:val="center"/>
             </w:pPr>
@@ -2597,6 +2607,7 @@
           </w:tcPr>
           <w:p>
             <w:pPr>
+              <w:keepNext/>
               <w:spacing w:after="0"/>
               <w:jc w:val="center"/>
             </w:pPr>
@@ -2615,6 +2626,7 @@
           </w:tcPr>
           <w:p>
             <w:pPr>
+              <w:keepNext/>
               <w:spacing w:after="0"/>
               <w:jc w:val="center"/>
             </w:pPr>
@@ -2838,7 +2850,7 @@
           <w:b w:val="0"/>
           <w:i w:val="0"/>
         </w:rPr>
-        <w:t>La Sprint Review a lieu le jour 5 : démonstration, retours, puis décision du Product Owner sur chaque story selon ses critères d'acceptation et la Definition of Done. Le tableau suivant est rempli pendant la review.</w:t>
+        <w:t>Prévue au jour 5, la Sprint Review s'est tenue en visio le vendredi 9 octobre (jour 4), une fois les stories terminées. Ibrahima a présenté la démonstration du tableau de bord avec le support de cinq slides, puis le Product Owner a décidé pour chaque story, selon ses critères d'acceptation et la Definition of Done.</w:t>
       </w:r>
     </w:p>
     <w:tbl>
@@ -2994,11 +3006,9 @@
             <w:r>
               <w:rPr>
                 <w:b w:val="0"/>
-                <w:i/>
-                <w:color w:val="5B5D7E"/>
                 <w:sz w:val="20"/>
               </w:rPr>
-              <w:t>À compléter</w:t>
+              <w:t>Acceptée</w:t>
             </w:r>
           </w:p>
         </w:tc>
@@ -3013,11 +3023,9 @@
             <w:r>
               <w:rPr>
                 <w:b w:val="0"/>
-                <w:i/>
-                <w:color w:val="5B5D7E"/>
                 <w:sz w:val="20"/>
               </w:rPr>
-              <w:t>À compléter</w:t>
+              <w:t>Aucun changement demandé. Confirmée par écrit sur le ticket #1 le 10/10.</w:t>
             </w:r>
           </w:p>
         </w:tc>
@@ -3075,11 +3083,9 @@
             <w:r>
               <w:rPr>
                 <w:b w:val="0"/>
-                <w:i/>
-                <w:color w:val="5B5D7E"/>
                 <w:sz w:val="20"/>
               </w:rPr>
-              <w:t>À compléter</w:t>
+              <w:t>Acceptée</w:t>
             </w:r>
           </w:p>
         </w:tc>
@@ -3095,11 +3101,9 @@
             <w:r>
               <w:rPr>
                 <w:b w:val="0"/>
-                <w:i/>
-                <w:color w:val="5B5D7E"/>
                 <w:sz w:val="20"/>
               </w:rPr>
-              <w:t>À compléter</w:t>
+              <w:t>Aucun changement demandé. Confirmée par écrit sur le ticket #2 le 10/10.</w:t>
             </w:r>
           </w:p>
         </w:tc>
@@ -3154,11 +3158,9 @@
             <w:r>
               <w:rPr>
                 <w:b w:val="0"/>
-                <w:i/>
-                <w:color w:val="5B5D7E"/>
                 <w:sz w:val="20"/>
               </w:rPr>
-              <w:t>À compléter</w:t>
+              <w:t>Acceptée</w:t>
             </w:r>
           </w:p>
         </w:tc>
@@ -3173,11 +3175,9 @@
             <w:r>
               <w:rPr>
                 <w:b w:val="0"/>
-                <w:i/>
-                <w:color w:val="5B5D7E"/>
                 <w:sz w:val="20"/>
               </w:rPr>
-              <w:t>À compléter</w:t>
+              <w:t>Aucun changement demandé. Confirmée par écrit sur le ticket #3 le 09/10.</w:t>
             </w:r>
           </w:p>
         </w:tc>
@@ -3235,11 +3235,9 @@
             <w:r>
               <w:rPr>
                 <w:b w:val="0"/>
-                <w:i/>
-                <w:color w:val="5B5D7E"/>
                 <w:sz w:val="20"/>
               </w:rPr>
-              <w:t>À compléter</w:t>
+              <w:t>Acceptée</w:t>
             </w:r>
           </w:p>
         </w:tc>
@@ -3255,11 +3253,9 @@
             <w:r>
               <w:rPr>
                 <w:b w:val="0"/>
-                <w:i/>
-                <w:color w:val="5B5D7E"/>
                 <w:sz w:val="20"/>
               </w:rPr>
-              <w:t>À compléter</w:t>
+              <w:t>Aucun changement demandé. Confirmée par écrit sur le ticket #4 le 09/10.</w:t>
             </w:r>
           </w:p>
         </w:tc>
@@ -3314,11 +3310,9 @@
             <w:r>
               <w:rPr>
                 <w:b w:val="0"/>
-                <w:i/>
-                <w:color w:val="5B5D7E"/>
                 <w:sz w:val="20"/>
               </w:rPr>
-              <w:t>À compléter</w:t>
+              <w:t>Acceptée</w:t>
             </w:r>
           </w:p>
         </w:tc>
@@ -3333,11 +3327,9 @@
             <w:r>
               <w:rPr>
                 <w:b w:val="0"/>
-                <w:i/>
-                <w:color w:val="5B5D7E"/>
                 <w:sz w:val="20"/>
               </w:rPr>
-              <w:t>À compléter</w:t>
+              <w:t>Aucun changement demandé. Confirmée par écrit sur le ticket #5 le 09/10.</w:t>
             </w:r>
           </w:p>
         </w:tc>
@@ -3395,11 +3387,9 @@
             <w:r>
               <w:rPr>
                 <w:b w:val="0"/>
-                <w:i/>
-                <w:color w:val="5B5D7E"/>
                 <w:sz w:val="20"/>
               </w:rPr>
-              <w:t>À compléter</w:t>
+              <w:t>Acceptée</w:t>
             </w:r>
           </w:p>
         </w:tc>
@@ -3415,11 +3405,9 @@
             <w:r>
               <w:rPr>
                 <w:b w:val="0"/>
-                <w:i/>
-                <w:color w:val="5B5D7E"/>
                 <w:sz w:val="20"/>
               </w:rPr>
-              <w:t>À compléter</w:t>
+              <w:t>Aucun changement demandé. Confirmée par écrit sur le ticket #6 le 09/10.</w:t>
             </w:r>
           </w:p>
         </w:tc>
@@ -3474,11 +3462,9 @@
             <w:r>
               <w:rPr>
                 <w:b w:val="0"/>
-                <w:i/>
-                <w:color w:val="5B5D7E"/>
                 <w:sz w:val="20"/>
               </w:rPr>
-              <w:t>À compléter</w:t>
+              <w:t>Acceptée</w:t>
             </w:r>
           </w:p>
         </w:tc>
@@ -3493,11 +3479,9 @@
             <w:r>
               <w:rPr>
                 <w:b w:val="0"/>
-                <w:i/>
-                <w:color w:val="5B5D7E"/>
                 <w:sz w:val="20"/>
               </w:rPr>
-              <w:t>À compléter</w:t>
+              <w:t>Hors engagement, prise au jour 4. Aucun changement demandé. Confirmée par écrit sur le ticket #7 le 09/10.</w:t>
             </w:r>
           </w:p>
         </w:tc>
@@ -3555,11 +3539,9 @@
             <w:r>
               <w:rPr>
                 <w:b w:val="0"/>
-                <w:i/>
-                <w:color w:val="5B5D7E"/>
                 <w:sz w:val="20"/>
               </w:rPr>
-              <w:t>À compléter</w:t>
+              <w:t>Acceptée</w:t>
             </w:r>
           </w:p>
         </w:tc>
@@ -3575,11 +3557,9 @@
             <w:r>
               <w:rPr>
                 <w:b w:val="0"/>
-                <w:i/>
-                <w:color w:val="5B5D7E"/>
                 <w:sz w:val="20"/>
               </w:rPr>
-              <w:t>À compléter</w:t>
+              <w:t>Aucun changement demandé. Confirmée par écrit sur le ticket #8 le 09/10.</w:t>
             </w:r>
           </w:p>
         </w:tc>
@@ -3601,10 +3581,25 @@
       <w:r>
         <w:rPr>
           <w:b w:val="0"/>
-          <w:i/>
-          <w:color w:val="5B5D7E"/>
+          <w:i w:val="0"/>
         </w:rPr>
-        <w:t>À compléter</w:t>
+        <w:t>aucune demande de changement, les huit stories ont été acceptées en l'état. Le Product Owner a confirmé chaque acceptation par écrit sur le ticket de la story (« En tant que PO, je valide »).</w:t>
+      </w:r>
+    </w:p>
+    <w:p>
+      <w:r>
+        <w:rPr>
+          <w:b/>
+          <w:i w:val="0"/>
+        </w:rPr>
+        <w:t xml:space="preserve">Bilan : </w:t>
+      </w:r>
+      <w:r>
+        <w:rPr>
+          <w:b w:val="0"/>
+          <w:i w:val="0"/>
+        </w:rPr>
+        <w:t>27 points acceptés, soit les 24 points engagés et les 3 points de US07 (Could), que le Sprint Planning prévoyait de prendre au jour 4 s'il restait de la capacité. Aucune story n'est refusée ni reportée.</w:t>
       </w:r>
     </w:p>
     <w:p>
@@ -3621,7 +3616,7 @@
           <w:b w:val="0"/>
           <w:i w:val="0"/>
         </w:rPr>
-        <w:t>La rétrospective a lieu après la review. Voici ce que nous avons déjà observé pendant le sprint, à discuter ensemble.</w:t>
+        <w:t>La rétrospective s'est tenue le samedi 10 octobre (jour 5), en visio, animée par la Scrum Master, avec les trois membres de l'équipe. La fiche complète est dans le dépôt (docs/07-retrospective).</w:t>
       </w:r>
     </w:p>
     <w:p>
@@ -3639,7 +3634,7 @@
         <w:rPr>
           <w:b w:val="0"/>
         </w:rPr>
-        <w:t>les pull requests relues ont fait remonter de vrais écarts (valeurs de contrôle du journal, légende d'un graphique) ; les calculs ont été vérifiés par une autre personne que celle qui les avait écrits ; tout le travail est traçable dans le dépôt.</w:t>
+        <w:t>les relectures de pull requests ont permis de corriger des erreurs avant la fusion ; les calculs ont été vérifiés par une autre personne que celle qui les avait écrits, et les chiffres sont les mêmes dans le CSV, le tableau de bord, les slides et le rapport ; toutes les stories ont été acceptées par le Product Owner à la Sprint Review, sans demande de changement.</w:t>
       </w:r>
     </w:p>
     <w:p>
@@ -3657,7 +3652,7 @@
         <w:rPr>
           <w:b w:val="0"/>
         </w:rPr>
-        <w:t>le fichier de données est passé de 178 à 289 lignes en cours de sprint, ce qui a obligé à corriger les valeurs de contrôle dans plusieurs documents ; le Product Owner n'avait pas encore rejoint le dépôt au jour 4 ; GitHub ne propose pas la protection de branche sur un dépôt privé gratuit, donc la règle « relu avant fusion » repose sur la discipline de l'équipe.</w:t>
+        <w:t>le dépôt a été créé au jour 3, donc le travail des jours 1 et 2 n'y apparaît pas ; le Product Owner n'a rejoint le dépôt qu'au jour 4 ; quelques changements ont été poussés directement sur main, sans relecture (GitHub ne propose pas la protection de branche sur un dépôt privé gratuit, la règle « relu avant fusion » repose donc sur la discipline de l'équipe) ; le fichier de données est passé de 178 à 289 commandes en cours de sprint ; beaucoup de travail s'est concentré sur les deux derniers jours.</w:t>
       </w:r>
     </w:p>
     <w:tbl>
@@ -3757,11 +3752,9 @@
             <w:r>
               <w:rPr>
                 <w:b w:val="0"/>
-                <w:i/>
-                <w:color w:val="5B5D7E"/>
                 <w:sz w:val="20"/>
               </w:rPr>
-              <w:t>À compléter</w:t>
+              <w:t>Créer le dépôt et le board dès le J1</w:t>
             </w:r>
           </w:p>
         </w:tc>
@@ -3776,11 +3769,9 @@
             <w:r>
               <w:rPr>
                 <w:b w:val="0"/>
-                <w:i/>
-                <w:color w:val="5B5D7E"/>
                 <w:sz w:val="20"/>
               </w:rPr>
-              <w:t>À compléter</w:t>
+              <w:t>Pousser directement sur main</w:t>
             </w:r>
           </w:p>
         </w:tc>
@@ -3795,11 +3786,68 @@
             <w:r>
               <w:rPr>
                 <w:b w:val="0"/>
-                <w:i/>
-                <w:color w:val="5B5D7E"/>
                 <w:sz w:val="20"/>
               </w:rPr>
-              <w:t>À compléter</w:t>
+              <w:t>Relire chaque PR avant fusion</w:t>
+            </w:r>
+          </w:p>
+        </w:tc>
+      </w:tr>
+      <w:tr>
+        <w:trPr>
+          <w:cantSplit/>
+        </w:trPr>
+        <w:tc>
+          <w:tcPr>
+            <w:tcW w:type="dxa" w:w="3118"/>
+            <w:shd w:val="clear" w:color="auto" w:fill="F1F1FA"/>
+          </w:tcPr>
+          <w:p>
+            <w:pPr>
+              <w:spacing w:after="0"/>
+            </w:pPr>
+            <w:r>
+              <w:rPr>
+                <w:b w:val="0"/>
+                <w:sz w:val="20"/>
+              </w:rPr>
+              <w:t>Noter le daily le jour même</w:t>
+            </w:r>
+          </w:p>
+        </w:tc>
+        <w:tc>
+          <w:tcPr>
+            <w:tcW w:type="dxa" w:w="3118"/>
+            <w:shd w:val="clear" w:color="auto" w:fill="F1F1FA"/>
+          </w:tcPr>
+          <w:p>
+            <w:pPr>
+              <w:spacing w:after="0"/>
+            </w:pPr>
+            <w:r>
+              <w:rPr>
+                <w:b w:val="0"/>
+                <w:sz w:val="20"/>
+              </w:rPr>
+              <w:t>Changer le fichier de données en cours de sprint</w:t>
+            </w:r>
+          </w:p>
+        </w:tc>
+        <w:tc>
+          <w:tcPr>
+            <w:tcW w:type="dxa" w:w="3175"/>
+            <w:shd w:val="clear" w:color="auto" w:fill="F1F1FA"/>
+          </w:tcPr>
+          <w:p>
+            <w:pPr>
+              <w:spacing w:after="0"/>
+            </w:pPr>
+            <w:r>
+              <w:rPr>
+                <w:b w:val="0"/>
+                <w:sz w:val="20"/>
+              </w:rPr>
+              <w:t>Vérifier les chiffres sur le CSV</w:t>
             </w:r>
           </w:p>
         </w:tc>
@@ -3821,10 +3869,9 @@
       <w:r>
         <w:rPr>
           <w:b w:val="0"/>
-          <w:i/>
-          <w:color w:val="5B5D7E"/>
+          <w:i w:val="0"/>
         </w:rPr>
-        <w:t>À compléter</w:t>
+        <w:t>créer le dépôt et le board dès le Sprint Planning, et noter le daily le jour même. Responsable : Ndeye Sokhna (Scrum Master).</w:t>
       </w:r>
     </w:p>
     <w:p>
@@ -4861,6 +4908,286 @@
           </w:p>
         </w:tc>
       </w:tr>
+      <w:tr>
+        <w:trPr>
+          <w:cantSplit/>
+        </w:trPr>
+        <w:tc>
+          <w:tcPr>
+            <w:tcW w:type="dxa" w:w="1304"/>
+            <w:shd w:val="clear" w:color="auto" w:fill="F1F1FA"/>
+          </w:tcPr>
+          <w:p>
+            <w:pPr>
+              <w:spacing w:after="0"/>
+            </w:pPr>
+            <w:r>
+              <w:rPr>
+                <w:b w:val="0"/>
+                <w:sz w:val="17"/>
+              </w:rPr>
+              <w:t>J5 – sam. 10/10</w:t>
+            </w:r>
+          </w:p>
+        </w:tc>
+        <w:tc>
+          <w:tcPr>
+            <w:tcW w:type="dxa" w:w="1247"/>
+            <w:shd w:val="clear" w:color="auto" w:fill="F1F1FA"/>
+          </w:tcPr>
+          <w:p>
+            <w:pPr>
+              <w:spacing w:after="0"/>
+            </w:pPr>
+            <w:r>
+              <w:rPr>
+                <w:b w:val="0"/>
+                <w:sz w:val="17"/>
+              </w:rPr>
+              <w:t>Ibrahima</w:t>
+            </w:r>
+          </w:p>
+        </w:tc>
+        <w:tc>
+          <w:tcPr>
+            <w:tcW w:type="dxa" w:w="2494"/>
+            <w:shd w:val="clear" w:color="auto" w:fill="F1F1FA"/>
+          </w:tcPr>
+          <w:p>
+            <w:pPr>
+              <w:spacing w:after="0"/>
+            </w:pPr>
+            <w:r>
+              <w:rPr>
+                <w:b w:val="0"/>
+                <w:sz w:val="17"/>
+              </w:rPr>
+              <w:t>Démo de l'incrément en Sprint Review (visio)</w:t>
+            </w:r>
+          </w:p>
+        </w:tc>
+        <w:tc>
+          <w:tcPr>
+            <w:tcW w:type="dxa" w:w="2835"/>
+            <w:shd w:val="clear" w:color="auto" w:fill="F1F1FA"/>
+          </w:tcPr>
+          <w:p>
+            <w:pPr>
+              <w:spacing w:after="0"/>
+            </w:pPr>
+            <w:r>
+              <w:rPr>
+                <w:b w:val="0"/>
+                <w:sz w:val="17"/>
+              </w:rPr>
+              <w:t>Rapport final (#56), remise (#57)</w:t>
+            </w:r>
+          </w:p>
+        </w:tc>
+        <w:tc>
+          <w:tcPr>
+            <w:tcW w:type="dxa" w:w="1531"/>
+            <w:shd w:val="clear" w:color="auto" w:fill="F1F1FA"/>
+          </w:tcPr>
+          <w:p>
+            <w:pPr>
+              <w:spacing w:after="0"/>
+            </w:pPr>
+            <w:r>
+              <w:rPr>
+                <w:b w:val="0"/>
+                <w:sz w:val="17"/>
+              </w:rPr>
+              <w:t>Aucun</w:t>
+            </w:r>
+          </w:p>
+        </w:tc>
+      </w:tr>
+      <w:tr>
+        <w:trPr>
+          <w:cantSplit/>
+        </w:trPr>
+        <w:tc>
+          <w:tcPr>
+            <w:tcW w:type="dxa" w:w="1304"/>
+          </w:tcPr>
+          <w:p>
+            <w:pPr>
+              <w:spacing w:after="0"/>
+            </w:pPr>
+            <w:r>
+              <w:rPr>
+                <w:b w:val="0"/>
+                <w:sz w:val="17"/>
+              </w:rPr>
+              <w:t>J5 – sam. 10/10</w:t>
+            </w:r>
+          </w:p>
+        </w:tc>
+        <w:tc>
+          <w:tcPr>
+            <w:tcW w:type="dxa" w:w="1247"/>
+          </w:tcPr>
+          <w:p>
+            <w:pPr>
+              <w:spacing w:after="0"/>
+            </w:pPr>
+            <w:r>
+              <w:rPr>
+                <w:b w:val="0"/>
+                <w:sz w:val="17"/>
+              </w:rPr>
+              <w:t>Isselmou</w:t>
+            </w:r>
+          </w:p>
+        </w:tc>
+        <w:tc>
+          <w:tcPr>
+            <w:tcW w:type="dxa" w:w="2494"/>
+          </w:tcPr>
+          <w:p>
+            <w:pPr>
+              <w:spacing w:after="0"/>
+            </w:pPr>
+            <w:r>
+              <w:rPr>
+                <w:b w:val="0"/>
+                <w:sz w:val="17"/>
+              </w:rPr>
+              <w:t>Sprint Review : toutes les stories acceptées</w:t>
+            </w:r>
+          </w:p>
+        </w:tc>
+        <w:tc>
+          <w:tcPr>
+            <w:tcW w:type="dxa" w:w="2835"/>
+          </w:tcPr>
+          <w:p>
+            <w:pPr>
+              <w:spacing w:after="0"/>
+            </w:pPr>
+            <w:r>
+              <w:rPr>
+                <w:b w:val="0"/>
+                <w:sz w:val="17"/>
+              </w:rPr>
+              <w:t>Compte rendu de la review (#54), rétrospective</w:t>
+            </w:r>
+          </w:p>
+        </w:tc>
+        <w:tc>
+          <w:tcPr>
+            <w:tcW w:type="dxa" w:w="1531"/>
+          </w:tcPr>
+          <w:p>
+            <w:pPr>
+              <w:spacing w:after="0"/>
+            </w:pPr>
+            <w:r>
+              <w:rPr>
+                <w:b w:val="0"/>
+                <w:sz w:val="17"/>
+              </w:rPr>
+              <w:t>Aucun</w:t>
+            </w:r>
+          </w:p>
+        </w:tc>
+      </w:tr>
+      <w:tr>
+        <w:trPr>
+          <w:cantSplit/>
+        </w:trPr>
+        <w:tc>
+          <w:tcPr>
+            <w:tcW w:type="dxa" w:w="1304"/>
+            <w:shd w:val="clear" w:color="auto" w:fill="F1F1FA"/>
+          </w:tcPr>
+          <w:p>
+            <w:pPr>
+              <w:spacing w:after="0"/>
+            </w:pPr>
+            <w:r>
+              <w:rPr>
+                <w:b w:val="0"/>
+                <w:sz w:val="17"/>
+              </w:rPr>
+              <w:t>J5 – sam. 10/10</w:t>
+            </w:r>
+          </w:p>
+        </w:tc>
+        <w:tc>
+          <w:tcPr>
+            <w:tcW w:type="dxa" w:w="1247"/>
+            <w:shd w:val="clear" w:color="auto" w:fill="F1F1FA"/>
+          </w:tcPr>
+          <w:p>
+            <w:pPr>
+              <w:spacing w:after="0"/>
+            </w:pPr>
+            <w:r>
+              <w:rPr>
+                <w:b w:val="0"/>
+                <w:sz w:val="17"/>
+              </w:rPr>
+              <w:t>Ndeye Sokhna</w:t>
+            </w:r>
+          </w:p>
+        </w:tc>
+        <w:tc>
+          <w:tcPr>
+            <w:tcW w:type="dxa" w:w="2494"/>
+            <w:shd w:val="clear" w:color="auto" w:fill="F1F1FA"/>
+          </w:tcPr>
+          <w:p>
+            <w:pPr>
+              <w:spacing w:after="0"/>
+            </w:pPr>
+            <w:r>
+              <w:rPr>
+                <w:b w:val="0"/>
+                <w:sz w:val="17"/>
+              </w:rPr>
+              <w:t>Sprint Review, relecture de #73 et #74</w:t>
+            </w:r>
+          </w:p>
+        </w:tc>
+        <w:tc>
+          <w:tcPr>
+            <w:tcW w:type="dxa" w:w="2835"/>
+            <w:shd w:val="clear" w:color="auto" w:fill="F1F1FA"/>
+          </w:tcPr>
+          <w:p>
+            <w:pPr>
+              <w:spacing w:after="0"/>
+            </w:pPr>
+            <w:r>
+              <w:rPr>
+                <w:b w:val="0"/>
+                <w:sz w:val="17"/>
+              </w:rPr>
+              <w:t>Rétrospective (#55)</w:t>
+            </w:r>
+          </w:p>
+        </w:tc>
+        <w:tc>
+          <w:tcPr>
+            <w:tcW w:type="dxa" w:w="1531"/>
+            <w:shd w:val="clear" w:color="auto" w:fill="F1F1FA"/>
+          </w:tcPr>
+          <w:p>
+            <w:pPr>
+              <w:spacing w:after="0"/>
+            </w:pPr>
+            <w:r>
+              <w:rPr>
+                <w:b w:val="0"/>
+                <w:sz w:val="17"/>
+              </w:rPr>
+              <w:t>Aucun</w:t>
+            </w:r>
+          </w:p>
+        </w:tc>
+      </w:tr>
     </w:tbl>
     <w:p>
       <w:pPr>

</xml_diff>

<commit_message>
Ajoute le lien du dépôt dans le rapport final
</commit_message>
<xml_diff>
--- a/docs/08-rapport-final/rapport-final.docx
+++ b/docs/08-rapport-final/rapport-final.docx
@@ -46,7 +46,7 @@
     </w:p>
     <w:p>
       <w:pPr>
-        <w:spacing w:after="200"/>
+        <w:spacing w:after="60"/>
       </w:pPr>
       <w:r>
         <w:rPr>
@@ -57,6 +57,28 @@
         </w:rPr>
         <w:t>Groupe 1  ·  Isselmou, Ndeye Sokhna, Ibrahima Gabar Diop  ·  Enseignant : Mama AMAR  ·  Année 2026-2027</w:t>
       </w:r>
+    </w:p>
+    <w:p>
+      <w:pPr>
+        <w:spacing w:after="200"/>
+      </w:pPr>
+      <w:r>
+        <w:rPr>
+          <w:color w:val="5B5D7E"/>
+          <w:sz w:val="21"/>
+        </w:rPr>
+        <w:t xml:space="preserve">Dépôt du projet : </w:t>
+      </w:r>
+      <w:hyperlink r:id="rIdDepot">
+        <w:r>
+          <w:rPr>
+            <w:color w:val="2F5496"/>
+            <w:sz w:val="21"/>
+            <w:u w:val="single"/>
+          </w:rPr>
+          <w:t>https://github.com/Gblack98/datasprint-agile</w:t>
+        </w:r>
+      </w:hyperlink>
     </w:p>
     <w:p>
       <w:pPr>

</xml_diff>

<commit_message>
Ajoute les captures du board au support et au rapport final
Slide 4 du support : captures du board au début et à la fin du sprint.
Rapport : la capture de fin rejoint celle du début dans l'annexe A,
le journal des daily passe sur une nouvelle page. PDF régénérés.

Co-Authored-By: Claude Opus 5.5 <noreply@anthropic.com>
</commit_message>
<xml_diff>
--- a/docs/08-rapport-final/rapport-final.docx
+++ b/docs/08-rapport-final/rapport-final.docx
@@ -3914,7 +3914,7 @@
         <w:pStyle w:val="Heading2"/>
       </w:pPr>
       <w:r>
-        <w:t>Annexe A. Board au début du sprint</w:t>
+        <w:t>Annexe A. Board au début et à la fin du sprint</w:t>
       </w:r>
     </w:p>
     <w:p>
@@ -3967,12 +3967,67 @@
           <w:color w:val="5B5D7E"/>
           <w:sz w:val="19"/>
         </w:rPr>
-        <w:t>Les 30 cartes sont dans la colonne À faire.</w:t>
+        <w:t>Début du sprint : les 30 cartes sont dans la colonne À faire.</w:t>
+      </w:r>
+    </w:p>
+    <w:p>
+      <w:pPr>
+        <w:spacing w:before="200"/>
+        <w:jc w:val="center"/>
+      </w:pPr>
+      <w:r>
+        <w:drawing>
+          <wp:inline xmlns:a="http://schemas.openxmlformats.org/drawingml/2006/main" xmlns:pic="http://schemas.openxmlformats.org/drawingml/2006/picture">
+            <wp:extent cx="5580000" cy="2361038"/>
+            <wp:docPr id="3" name="Picture 3"/>
+            <wp:cNvGraphicFramePr>
+              <a:graphicFrameLocks noChangeAspect="1"/>
+            </wp:cNvGraphicFramePr>
+            <a:graphic>
+              <a:graphicData uri="http://schemas.openxmlformats.org/drawingml/2006/picture">
+                <pic:pic>
+                  <pic:nvPicPr>
+                    <pic:cNvPr id="0" name="board-fin-sprint.png"/>
+                    <pic:cNvPicPr/>
+                  </pic:nvPicPr>
+                  <pic:blipFill>
+                    <a:blip r:embed="rId12"/>
+                    <a:stretch>
+                      <a:fillRect/>
+                    </a:stretch>
+                  </pic:blipFill>
+                  <pic:spPr>
+                    <a:xfrm>
+                      <a:off x="0" y="0"/>
+                      <a:ext cx="5580000" cy="2361038"/>
+                    </a:xfrm>
+                    <a:prstGeom prst="rect"/>
+                  </pic:spPr>
+                </pic:pic>
+              </a:graphicData>
+            </a:graphic>
+          </wp:inline>
+        </w:drawing>
+      </w:r>
+    </w:p>
+    <w:p>
+      <w:pPr>
+        <w:jc w:val="center"/>
+      </w:pPr>
+      <w:r>
+        <w:rPr>
+          <w:b w:val="0"/>
+          <w:i/>
+          <w:color w:val="5B5D7E"/>
+          <w:sz w:val="19"/>
+        </w:rPr>
+        <w:t>Fin du sprint : 29 cartes sont dans la colonne Terminé, il reste la remise du dossier.</w:t>
       </w:r>
     </w:p>
     <w:p>
       <w:pPr>
         <w:pStyle w:val="Heading2"/>
+        <w:pageBreakBefore/>
       </w:pPr>
       <w:r>
         <w:t>Annexe B. Journal des daily</w:t>

</xml_diff>

<commit_message>
Aligne le rapport, le support et le journal sur l'historique du dépôt
Relecture des PR : présentée comme la règle, avec le compte réel du sprint
(7 PR relues sur 9). Journal : la ligne du J3 retrouve les valeurs du
premier fichier (178 commandes), une note indique le recalcul du J4.

Co-Authored-By: Claude Opus 5.5 <noreply@anthropic.com>
</commit_message>
<xml_diff>
--- a/docs/08-rapport-final/rapport-final.docx
+++ b/docs/08-rapport-final/rapport-final.docx
@@ -457,7 +457,7 @@
           <w:b w:val="0"/>
           <w:i w:val="0"/>
         </w:rPr>
-        <w:t>Le rôle dit qui veille à ce qu'une chose soit faite, pas qui la fait seul : nous travaillons ensemble sur l'ensemble du projet. Les règles sont écrites dans le dépôt et suivies par toute l'équipe.</w:t>
+        <w:t>Le rôle dit qui veille à ce qu'une chose soit faite, pas qui la fait seul : nous travaillons ensemble sur l'ensemble du projet. Les règles sont écrites dans le dépôt.</w:t>
       </w:r>
     </w:p>
     <w:p>
@@ -529,7 +529,7 @@
         <w:rPr>
           <w:b w:val="0"/>
         </w:rPr>
-        <w:t>Tout ajout au dépôt passe par une pull request relue par un autre membre avant d'être fusionné.</w:t>
+        <w:t>La règle : tout ajout au dépôt passe par une pull request relue par un autre membre avant d'être fusionné. Pendant le sprint, 7 des 9 pull requests fusionnées ont été relues ; celles du tableau de bord (#71) et de la rétrospective (#78) ne l'ont pas été.</w:t>
       </w:r>
     </w:p>
     <w:p>
@@ -4669,7 +4669,7 @@
                 <w:b w:val="0"/>
                 <w:sz w:val="17"/>
               </w:rPr>
-              <w:t>Valeurs de contrôle calculées : CA 4 066 000 FCFA, 289 commandes, panier moyen 14 069 FCFA</w:t>
+              <w:t>Valeurs de contrôle calculées : CA 2 431 000 FCFA, 178 commandes, panier moyen 13 657 FCFA</w:t>
             </w:r>
           </w:p>
         </w:tc>
@@ -5268,6 +5268,20 @@
     </w:tbl>
     <w:p>
       <w:pPr>
+        <w:spacing w:before="120"/>
+      </w:pPr>
+      <w:r>
+        <w:rPr>
+          <w:b w:val="0"/>
+          <w:i/>
+          <w:color w:val="5B5D7E"/>
+          <w:sz w:val="19"/>
+        </w:rPr>
+        <w:t>Note : les valeurs de contrôle du J3 portent sur le premier fichier de ventes (178 commandes). Le fichier est passé à 289 commandes le J4 et les valeurs ont été recalculées ce jour-là : CA 4 066 000 FCFA, 289 commandes, panier moyen 14 069 FCFA (PR #72).</w:t>
+      </w:r>
+    </w:p>
+    <w:p>
+      <w:pPr>
         <w:spacing w:after="40"/>
       </w:pPr>
     </w:p>

</xml_diff>

<commit_message>
Ajoute le lien du tableau de bord en ligne dans le rapport final
Page 1, sous le lien du dépôt : copie de consultation mise en ligne
après le sprint. PDF régénéré, seule la page 1 change.

Co-Authored-By: Claude Opus 5.5 <noreply@anthropic.com>
</commit_message>
<xml_diff>
--- a/docs/08-rapport-final/rapport-final.docx
+++ b/docs/08-rapport-final/rapport-final.docx
@@ -60,7 +60,7 @@
     </w:p>
     <w:p>
       <w:pPr>
-        <w:spacing w:after="200"/>
+        <w:spacing w:after="0"/>
       </w:pPr>
       <w:r>
         <w:rPr>
@@ -77,6 +77,28 @@
             <w:u w:val="single"/>
           </w:rPr>
           <w:t>https://github.com/Gblack98/datasprint-agile</w:t>
+        </w:r>
+      </w:hyperlink>
+    </w:p>
+    <w:p>
+      <w:pPr>
+        <w:spacing w:after="200"/>
+      </w:pPr>
+      <w:r>
+        <w:rPr>
+          <w:color w:val="5B5D7E"/>
+          <w:sz w:val="21"/>
+        </w:rPr>
+        <w:t xml:space="preserve">Tableau de bord en ligne (copie de consultation, après le sprint) : </w:t>
+      </w:r>
+      <w:hyperlink r:id="rId13">
+        <w:r>
+          <w:rPr>
+            <w:color w:val="2F5496"/>
+            <w:sz w:val="21"/>
+            <w:u w:val="single"/>
+          </w:rPr>
+          <w:t>https://datasprint-agile.vercel.app</w:t>
         </w:r>
       </w:hyperlink>
     </w:p>

</xml_diff>

<commit_message>
Écrit les noms complets des trois membres
Rapport (en-tête et tableau de l'équipe), support de démonstration
(slide 1), README et fiche projet : Isselmou Sidi OUMOU, Ndeye Sokhna
NOKHO, Ibrahima Gabar DIOP. Avant, un seul membre avait son nom de
famille. PDF régénérés.

Co-Authored-By: Claude Opus 5.5 <noreply@anthropic.com>
</commit_message>
<xml_diff>
--- a/docs/08-rapport-final/rapport-final.docx
+++ b/docs/08-rapport-final/rapport-final.docx
@@ -46,6 +46,20 @@
     </w:p>
     <w:p>
       <w:pPr>
+        <w:spacing w:after="0"/>
+      </w:pPr>
+      <w:r>
+        <w:rPr>
+          <w:b w:val="0"/>
+          <w:i w:val="0"/>
+          <w:color w:val="5B5D7E"/>
+          <w:sz w:val="21"/>
+        </w:rPr>
+        <w:t>Groupe 1  ·  Isselmou Sidi OUMOU, Ndeye Sokhna NOKHO, Ibrahima Gabar DIOP</w:t>
+      </w:r>
+    </w:p>
+    <w:p>
+      <w:pPr>
         <w:spacing w:after="60"/>
       </w:pPr>
       <w:r>
@@ -55,7 +69,7 @@
           <w:color w:val="5B5D7E"/>
           <w:sz w:val="21"/>
         </w:rPr>
-        <w:t>Groupe 1  ·  Isselmou, Ndeye Sokhna, Ibrahima Gabar Diop  ·  Enseignant : Mama AMAR  ·  Année 2026-2027</w:t>
+        <w:t>Enseignant : Mama AMAR  ·  Année 2026-2027</w:t>
       </w:r>
     </w:p>
     <w:p>
@@ -330,7 +344,7 @@
                 <w:b w:val="0"/>
                 <w:sz w:val="20"/>
               </w:rPr>
-              <w:t>Isselmou</w:t>
+              <w:t>Isselmou Sidi OUMOU</w:t>
             </w:r>
           </w:p>
         </w:tc>
@@ -388,7 +402,7 @@
                 <w:b w:val="0"/>
                 <w:sz w:val="20"/>
               </w:rPr>
-              <w:t>Ndeye Sokhna</w:t>
+              <w:t>Ndeye Sokhna NOKHO</w:t>
             </w:r>
           </w:p>
         </w:tc>
@@ -445,7 +459,7 @@
                 <w:b w:val="0"/>
                 <w:sz w:val="20"/>
               </w:rPr>
-              <w:t>Ibrahima Gabar Diop</w:t>
+              <w:t>Ibrahima Gabar DIOP</w:t>
             </w:r>
           </w:p>
         </w:tc>

</xml_diff>